<commit_message>
Added resume and certificates
</commit_message>
<xml_diff>
--- a/resume/Deepanshu_Bansal_Resume.docx
+++ b/resume/Deepanshu_Bansal_Resume.docx
@@ -631,23 +631,7 @@
           <w:szCs w:val="19"/>
           <w:lang w:val="en-IN"/>
         </w:rPr>
-        <w:t xml:space="preserve"> Used </w:t>
-      </w:r>
-      <w:r>
-        <w:rPr>
-          <w:sz w:val="19"/>
-          <w:szCs w:val="19"/>
-          <w:lang w:val="en-IN"/>
-        </w:rPr>
-        <w:t>MS-</w:t>
-      </w:r>
-      <w:r>
-        <w:rPr>
-          <w:sz w:val="19"/>
-          <w:szCs w:val="19"/>
-          <w:lang w:val="en-IN"/>
-        </w:rPr>
-        <w:t xml:space="preserve">SQL Server to analyze churn and revenue using joins, CTEs, and </w:t>
+        <w:t xml:space="preserve"> Used MS-SQL Server to analyze churn and revenue using joins, CTEs, and </w:t>
       </w:r>
       <w:r>
         <w:rPr>
@@ -3736,6 +3720,7 @@
   <w:style w:type="character" w:default="1" w:styleId="DefaultParagraphFont">
     <w:name w:val="Default Paragraph Font"/>
     <w:uiPriority w:val="1"/>
+    <w:semiHidden/>
     <w:unhideWhenUsed/>
   </w:style>
   <w:style w:type="table" w:default="1" w:styleId="TableNormal">

</xml_diff>